<commit_message>
docs: Cap nhat thong tin 3 sinh vien nhom thuc hien va GVHD vao bao cao HUTECH
</commit_message>
<xml_diff>
--- a/docs/BAO_CAO_DO_AN_HUTECH.docx
+++ b/docs/BAO_CAO_DO_AN_HUTECH.docx
@@ -34,7 +34,7 @@
     </w:p>
     <w:p>
       <w:pPr>
-        <w:spacing w:before="0" w:after="480" w:line="360" w:lineRule="auto"/>
+        <w:spacing w:before="0" w:after="400" w:line="360" w:lineRule="auto"/>
         <w:jc w:val="center"/>
       </w:pPr>
       <w:r>
@@ -49,7 +49,7 @@
     </w:p>
     <w:p>
       <w:pPr>
-        <w:spacing w:before="400" w:after="80" w:line="360" w:lineRule="auto"/>
+        <w:spacing w:before="320" w:after="80" w:line="360" w:lineRule="auto"/>
         <w:jc w:val="center"/>
       </w:pPr>
       <w:r>
@@ -64,7 +64,7 @@
     </w:p>
     <w:p>
       <w:pPr>
-        <w:spacing w:before="0" w:after="600" w:line="360" w:lineRule="auto"/>
+        <w:spacing w:before="0" w:after="480" w:line="360" w:lineRule="auto"/>
         <w:jc w:val="center"/>
       </w:pPr>
       <w:r>
@@ -79,7 +79,7 @@
     </w:p>
     <w:p>
       <w:pPr>
-        <w:spacing w:before="200" w:after="120" w:line="360" w:lineRule="auto"/>
+        <w:spacing w:before="120" w:after="80" w:line="360" w:lineRule="auto"/>
         <w:jc w:val="center"/>
       </w:pPr>
       <w:r>
@@ -94,7 +94,7 @@
     </w:p>
     <w:p>
       <w:pPr>
-        <w:spacing w:before="80" w:after="800" w:line="360" w:lineRule="auto"/>
+        <w:spacing w:before="40" w:after="560" w:line="360" w:lineRule="auto"/>
         <w:jc w:val="center"/>
       </w:pPr>
       <w:r>
@@ -114,7 +114,7 @@
         <w:tblLook w:firstColumn="1" w:firstRow="1" w:lastColumn="0" w:lastRow="0" w:noHBand="0" w:noVBand="1" w:val="04A0"/>
       </w:tblPr>
       <w:tblGrid>
-        <w:gridCol w:w="3168"/>
+        <w:gridCol w:w="3312"/>
         <w:gridCol w:w="5760"/>
       </w:tblGrid>
       <w:tr>
@@ -124,13 +124,13 @@
           </w:tcPr>
           <w:p>
             <w:pPr>
-              <w:spacing w:line="312" w:lineRule="auto" w:before="40" w:after="40"/>
+              <w:spacing w:line="300" w:lineRule="auto" w:before="40" w:after="40"/>
             </w:pPr>
             <w:r>
               <w:rPr>
                 <w:rFonts w:ascii="Times New Roman" w:hAnsi="Times New Roman"/>
                 <w:b/>
-                <w:sz w:val="26"/>
+                <w:sz w:val="25"/>
               </w:rPr>
               <w:t>Giảng viên hướng dẫn:</w:t>
             </w:r>
@@ -142,12 +142,12 @@
           </w:tcPr>
           <w:p>
             <w:pPr>
-              <w:spacing w:line="312" w:lineRule="auto" w:before="40" w:after="40"/>
+              <w:spacing w:line="300" w:lineRule="auto" w:before="40" w:after="40"/>
             </w:pPr>
             <w:r>
               <w:rPr>
                 <w:rFonts w:ascii="Times New Roman" w:hAnsi="Times New Roman"/>
-                <w:sz w:val="26"/>
+                <w:sz w:val="25"/>
               </w:rPr>
               <w:t>ThS. Đinh Phương Nam</w:t>
             </w:r>
@@ -161,15 +161,15 @@
           </w:tcPr>
           <w:p>
             <w:pPr>
-              <w:spacing w:line="312" w:lineRule="auto" w:before="40" w:after="40"/>
+              <w:spacing w:line="300" w:lineRule="auto" w:before="40" w:after="40"/>
             </w:pPr>
             <w:r>
               <w:rPr>
                 <w:rFonts w:ascii="Times New Roman" w:hAnsi="Times New Roman"/>
                 <w:b/>
-                <w:sz w:val="26"/>
+                <w:sz w:val="25"/>
               </w:rPr>
-              <w:t>Sinh viên thực hiện:</w:t>
+              <w:t>Sinh viên/Nhóm thực hiện:</w:t>
             </w:r>
           </w:p>
         </w:tc>
@@ -179,14 +179,14 @@
           </w:tcPr>
           <w:p>
             <w:pPr>
-              <w:spacing w:line="312" w:lineRule="auto" w:before="40" w:after="40"/>
+              <w:spacing w:line="300" w:lineRule="auto" w:before="40" w:after="40"/>
             </w:pPr>
             <w:r>
               <w:rPr>
                 <w:rFonts w:ascii="Times New Roman" w:hAnsi="Times New Roman"/>
-                <w:sz w:val="26"/>
+                <w:sz w:val="25"/>
               </w:rPr>
-              <w:t>Nguyễn Nhật Lâm</w:t>
+              <w:t>1. Nguyễn Phi Phúc   — MSSV: 2387701131 (Lớp 23DATA1)</w:t>
             </w:r>
           </w:p>
         </w:tc>
@@ -198,16 +198,8 @@
           </w:tcPr>
           <w:p>
             <w:pPr>
-              <w:spacing w:line="312" w:lineRule="auto" w:before="40" w:after="40"/>
+              <w:spacing w:line="300" w:lineRule="auto" w:before="40" w:after="40"/>
             </w:pPr>
-            <w:r>
-              <w:rPr>
-                <w:rFonts w:ascii="Times New Roman" w:hAnsi="Times New Roman"/>
-                <w:b/>
-                <w:sz w:val="26"/>
-              </w:rPr>
-              <w:t>Mã số sinh viên:</w:t>
-            </w:r>
           </w:p>
         </w:tc>
         <w:tc>
@@ -216,14 +208,14 @@
           </w:tcPr>
           <w:p>
             <w:pPr>
-              <w:spacing w:line="312" w:lineRule="auto" w:before="40" w:after="40"/>
+              <w:spacing w:line="300" w:lineRule="auto" w:before="40" w:after="40"/>
             </w:pPr>
             <w:r>
               <w:rPr>
                 <w:rFonts w:ascii="Times New Roman" w:hAnsi="Times New Roman"/>
-                <w:sz w:val="26"/>
+                <w:sz w:val="25"/>
               </w:rPr>
-              <w:t>2387700036</w:t>
+              <w:t>2. Trần Minh Khang  — MSSV: 2387700027 (Lớp 23DATA1)</w:t>
             </w:r>
           </w:p>
         </w:tc>
@@ -235,16 +227,8 @@
           </w:tcPr>
           <w:p>
             <w:pPr>
-              <w:spacing w:line="312" w:lineRule="auto" w:before="40" w:after="40"/>
+              <w:spacing w:line="300" w:lineRule="auto" w:before="40" w:after="40"/>
             </w:pPr>
-            <w:r>
-              <w:rPr>
-                <w:rFonts w:ascii="Times New Roman" w:hAnsi="Times New Roman"/>
-                <w:b/>
-                <w:sz w:val="26"/>
-              </w:rPr>
-              <w:t>Lớp:</w:t>
-            </w:r>
           </w:p>
         </w:tc>
         <w:tc>
@@ -253,14 +237,14 @@
           </w:tcPr>
           <w:p>
             <w:pPr>
-              <w:spacing w:line="312" w:lineRule="auto" w:before="40" w:after="40"/>
+              <w:spacing w:line="300" w:lineRule="auto" w:before="40" w:after="40"/>
             </w:pPr>
             <w:r>
               <w:rPr>
                 <w:rFonts w:ascii="Times New Roman" w:hAnsi="Times New Roman"/>
-                <w:sz w:val="26"/>
+                <w:sz w:val="25"/>
               </w:rPr>
-              <w:t>23DATA1</w:t>
+              <w:t>3. Nguyễn Nhật Lâm  — MSSV: 2387700036 (Lớp 23DATA1)</w:t>
             </w:r>
           </w:p>
         </w:tc>
@@ -272,13 +256,13 @@
           </w:tcPr>
           <w:p>
             <w:pPr>
-              <w:spacing w:line="312" w:lineRule="auto" w:before="40" w:after="40"/>
+              <w:spacing w:line="300" w:lineRule="auto" w:before="40" w:after="40"/>
             </w:pPr>
             <w:r>
               <w:rPr>
                 <w:rFonts w:ascii="Times New Roman" w:hAnsi="Times New Roman"/>
                 <w:b/>
-                <w:sz w:val="26"/>
+                <w:sz w:val="25"/>
               </w:rPr>
               <w:t>Chuyên ngành:</w:t>
             </w:r>
@@ -290,22 +274,59 @@
           </w:tcPr>
           <w:p>
             <w:pPr>
-              <w:spacing w:line="312" w:lineRule="auto" w:before="40" w:after="40"/>
+              <w:spacing w:line="300" w:lineRule="auto" w:before="40" w:after="40"/>
             </w:pPr>
             <w:r>
               <w:rPr>
                 <w:rFonts w:ascii="Times New Roman" w:hAnsi="Times New Roman"/>
-                <w:sz w:val="26"/>
+                <w:sz w:val="25"/>
               </w:rPr>
               <w:t>An toàn thông tin</w:t>
             </w:r>
           </w:p>
         </w:tc>
       </w:tr>
+      <w:tr>
+        <w:tc>
+          <w:tcPr>
+            <w:tcW w:type="dxa" w:w="4536"/>
+          </w:tcPr>
+          <w:p>
+            <w:pPr>
+              <w:spacing w:line="300" w:lineRule="auto" w:before="40" w:after="40"/>
+            </w:pPr>
+            <w:r>
+              <w:rPr>
+                <w:rFonts w:ascii="Times New Roman" w:hAnsi="Times New Roman"/>
+                <w:b/>
+                <w:sz w:val="25"/>
+              </w:rPr>
+              <w:t>Khoa:</w:t>
+            </w:r>
+          </w:p>
+        </w:tc>
+        <w:tc>
+          <w:tcPr>
+            <w:tcW w:type="dxa" w:w="4536"/>
+          </w:tcPr>
+          <w:p>
+            <w:pPr>
+              <w:spacing w:line="300" w:lineRule="auto" w:before="40" w:after="40"/>
+            </w:pPr>
+            <w:r>
+              <w:rPr>
+                <w:rFonts w:ascii="Times New Roman" w:hAnsi="Times New Roman"/>
+                <w:sz w:val="25"/>
+              </w:rPr>
+              <w:t>Công nghệ thông tin</w:t>
+            </w:r>
+          </w:p>
+        </w:tc>
+      </w:tr>
     </w:tbl>
     <w:p>
       <w:pPr>
-        <w:spacing w:before="1200" w:after="0" w:line="360" w:lineRule="auto"/>
+        <w:spacing w:before="900" w:after="0" w:line="360" w:lineRule="auto"/>
         <w:jc w:val="center"/>
       </w:pPr>
       <w:r>
@@ -350,7 +371,7 @@
           <w:i w:val="0"/>
           <w:sz w:val="26"/>
         </w:rPr>
-        <w:t>Người viết xin cam đoan đây là công trình nghiên cứu và báo cáo đồ án do chính người viết thực hiện dưới sự hướng dẫn khoa học của Giảng viên hướng dẫn. Các nội dung nghiên cứu lý thuyết, phương pháp kỹ thuật, mã nguồn phần mềm và kết quả đo lường thực nghiệm được trình bày trong báo cáo này là hoàn toàn trung thực và chưa từng được công bố trong bất kỳ công trình đồ án hay khóa luận nào khác.</w:t>
+        <w:t>Nhóm sinh viên thực hiện xin cam đoan đây là công trình nghiên cứu và báo cáo đồ án do chính các thành viên trong nhóm thực hiện dưới sự hướng dẫn khoa học của Giảng viên hướng dẫn – ThS. Đinh Phương Nam. Các nội dung nghiên cứu lý thuyết, phương pháp kỹ thuật, mã nguồn phần mềm và kết quả đo lường thực nghiệm được trình bày trong báo cáo này là hoàn toàn trung thực, khách quan và chưa từng được công bố trong bất kỳ công trình đồ án hay khóa luận nào khác.</w:t>
       </w:r>
     </w:p>
     <w:p>
@@ -365,32 +386,27 @@
           <w:i w:val="0"/>
           <w:sz w:val="26"/>
         </w:rPr>
-        <w:t>Toàn bộ các tài liệu tham khảo, chuẩn dữ liệu kỹ thuật và thư viện phần mềm mã nguồn mở được kế thừa trong đề tài đều được trích dẫn nguồn gốc rõ ràng, minh bạch theo đúng quy chuẩn học thuật của Trường Đại học Công nghệ TP.HCM (HUTECH). Người viết xin chịu hoàn toàn trách nhiệm trước Nhà trường và pháp luật về tính trung thực của lời cam đoan này.</w:t>
+        <w:t>Toàn bộ các tài liệu tham khảo, chuẩn dữ liệu kỹ thuật quốc tế và thư viện phần mềm mã nguồn mở được kế thừa trong đề tài đều được trích dẫn nguồn gốc rõ ràng, minh bạch theo đúng quy chuẩn học thuật của Trường Đại học Công nghệ TP.HCM (HUTECH). Nhóm sinh viên thực hiện xin chịu hoàn toàn trách nhiệm trước Nhà trường và pháp luật về tính trung thực của lời cam đoan này.</w:t>
       </w:r>
     </w:p>
     <w:p>
       <w:pPr>
-        <w:spacing w:before="400" w:after="40" w:line="360" w:lineRule="auto"/>
+        <w:spacing w:before="320" w:after="80" w:line="360" w:lineRule="auto"/>
         <w:jc w:val="right"/>
       </w:pPr>
       <w:r>
         <w:rPr>
           <w:rFonts w:ascii="Times New Roman" w:hAnsi="Times New Roman"/>
           <w:b w:val="0"/>
-          <w:i w:val="0"/>
+          <w:i/>
           <w:sz w:val="26"/>
         </w:rPr>
         <w:t>TP. Hồ Chí Minh, ngày 07 tháng 10 năm 2026</w:t>
-        <w:br/>
-        <w:t>Sinh viên thực hiện</w:t>
-        <w:br/>
-        <w:br/>
-        <w:br/>
       </w:r>
     </w:p>
     <w:p>
       <w:pPr>
-        <w:spacing w:before="0" w:after="0" w:line="360" w:lineRule="auto"/>
+        <w:spacing w:before="0" w:after="600" w:line="360" w:lineRule="auto"/>
         <w:jc w:val="right"/>
       </w:pPr>
       <w:r>
@@ -400,9 +416,77 @@
           <w:i w:val="0"/>
           <w:sz w:val="26"/>
         </w:rPr>
-        <w:t>Nguyễn Nhật Lâm</w:t>
+        <w:t>Nhóm sinh viên thực hiện</w:t>
       </w:r>
     </w:p>
+    <w:tbl>
+      <w:tblPr>
+        <w:tblW w:type="auto" w:w="0"/>
+        <w:jc w:val="center"/>
+        <w:tblLook w:firstColumn="1" w:firstRow="1" w:lastColumn="0" w:lastRow="0" w:noHBand="0" w:noVBand="1" w:val="04A0"/>
+      </w:tblPr>
+      <w:tblGrid>
+        <w:gridCol w:w="3024"/>
+        <w:gridCol w:w="3024"/>
+        <w:gridCol w:w="3024"/>
+      </w:tblGrid>
+      <w:tr>
+        <w:tc>
+          <w:tcPr>
+            <w:tcW w:type="dxa" w:w="3024"/>
+          </w:tcPr>
+          <w:p>
+            <w:pPr>
+              <w:jc w:val="center"/>
+            </w:pPr>
+            <w:r>
+              <w:rPr>
+                <w:rFonts w:ascii="Times New Roman" w:hAnsi="Times New Roman"/>
+                <w:b/>
+                <w:sz w:val="26"/>
+              </w:rPr>
+              <w:t>Nguyễn Phi Phúc</w:t>
+            </w:r>
+          </w:p>
+        </w:tc>
+        <w:tc>
+          <w:tcPr>
+            <w:tcW w:type="dxa" w:w="3024"/>
+          </w:tcPr>
+          <w:p>
+            <w:pPr>
+              <w:jc w:val="center"/>
+            </w:pPr>
+            <w:r>
+              <w:rPr>
+                <w:rFonts w:ascii="Times New Roman" w:hAnsi="Times New Roman"/>
+                <w:b/>
+                <w:sz w:val="26"/>
+              </w:rPr>
+              <w:t>Trần Minh Khang</w:t>
+            </w:r>
+          </w:p>
+        </w:tc>
+        <w:tc>
+          <w:tcPr>
+            <w:tcW w:type="dxa" w:w="3024"/>
+          </w:tcPr>
+          <w:p>
+            <w:pPr>
+              <w:jc w:val="center"/>
+            </w:pPr>
+            <w:r>
+              <w:rPr>
+                <w:rFonts w:ascii="Times New Roman" w:hAnsi="Times New Roman"/>
+                <w:b/>
+                <w:sz w:val="26"/>
+              </w:rPr>
+              <w:t>Nguyễn Nhật Lâm</w:t>
+            </w:r>
+          </w:p>
+        </w:tc>
+      </w:tr>
+    </w:tbl>
     <w:p>
       <w:r>
         <w:br w:type="page"/>
@@ -435,7 +519,7 @@
           <w:i w:val="0"/>
           <w:sz w:val="26"/>
         </w:rPr>
-        <w:t>Để hoàn thành đồ án này, người viết xin bày tỏ lòng biết ơn sâu sắc và chân thành nhất đến quý Thầy Cô Khoa Công nghệ Thông tin, Trường Đại học Công nghệ TP.HCM (HUTECH) đã tận tình truyền đạt kiến thức chuyên môn vững chắc và phương pháp nghiên cứu khoa học trong suốt quá trình học tập tại trường.</w:t>
+        <w:t>Để hoàn thành đồ án này, nhóm sinh viên thực hiện xin bày tỏ lòng biết ơn sâu sắc và chân thành nhất đến quý Thầy Cô Khoa Công nghệ Thông tin, Trường Đại học Công nghệ TP.HCM (HUTECH) đã tận tình truyền đạt những kiến thức chuyên môn nền tảng vững chắc và phương pháp nghiên cứu khoa học quý báu trong suốt quá trình học tập và rèn luyện tại trường.</w:t>
       </w:r>
     </w:p>
     <w:p>
@@ -450,7 +534,7 @@
           <w:i w:val="0"/>
           <w:sz w:val="26"/>
         </w:rPr>
-        <w:t>Đặc biệt, người viết xin gửi lời cảm ơn trân trọng nhất đến Thầy ThS. Đinh Phương Nam, người đã trực tiếp định hướng, góp ý chuyên môn quý báu và tận tình hướng dẫn người viết trong suốt quá trình hoàn thiện đề tài nghiên cứu này.</w:t>
+        <w:t>Đặc biệt, nhóm xin gửi lời cảm ơn trân trọng nhất đến Thầy ThS. Đinh Phương Nam, người đã trực tiếp định hướng đề tài, tận tình góp ý chuyên môn sâu sát và luôn động viên, hỗ trợ nhóm tháo gỡ các vướng mắc kỹ thuật trong suốt quá trình nghiên cứu và hiện thực hóa hệ thống.</w:t>
       </w:r>
     </w:p>
     <w:p>
@@ -465,7 +549,7 @@
           <w:i w:val="0"/>
           <w:sz w:val="26"/>
         </w:rPr>
-        <w:t>Mặc dù đã nỗ lực hết sức để hoàn thiện báo cáo một cách toàn diện và chính xác nhất, song do hạn chế về thời gian và kinh nghiệm thực tiễn, đề tài khó tránh khỏi những thiếu sót nhất định. Người viết rất mong nhận được những ý kiến đóng góp quý báu từ quý Thầy Cô trong Hội đồng phản biện để đề tài ngày càng hoàn thiện hơn.</w:t>
+        <w:t>Mặc dù đã nỗ lực hết sức để hoàn thiện báo cáo một cách toàn diện và khoa học nhất, song do giới hạn về mặt thời gian và kinh nghiệm thực tiễn, đề tài khó tránh khỏi những thiếu sót nhất định. Nhóm sinh viên thực hiện rất mong nhận được những ý kiến đóng góp, chỉ bảo quý báu từ quý Thầy Cô trong Hội đồng chấm thi để công trình ngày càng hoàn thiện hơn và có tính ứng dụng thực tiễn cao hơn.</w:t>
       </w:r>
     </w:p>
     <w:p>
@@ -1266,7 +1350,7 @@
           <w:rFonts w:ascii="Times New Roman" w:hAnsi="Times New Roman"/>
           <w:sz w:val="26"/>
         </w:rPr>
-        <w:t>Bảng 2.1. So sánh chuẩn TLP trong phân loại dữ liệu tình báo</w:t>
+        <w:t>Bảng 1.1. So sánh chuẩn TLP trong phân loại dữ liệu tình báo</w:t>
       </w:r>
     </w:p>
     <w:p>
@@ -2003,7 +2087,7 @@
           <w:i w:val="0"/>
           <w:sz w:val="26"/>
         </w:rPr>
-        <w:t>Kiến trúc ReAct (Reasoning and Acting) kết hợp giữa suy luận (Reasoning trace) và hành động (Actions). Thay vì chỉ phản hồi tĩnh, Agent tự đánh giá ngữ cảnh, quyết định gọi lần lượt các công cụ độc lập (Tool-Calling) và quan sát kết quả trả về (Observation) để giải quyết các bài toán bảo mật phức tạp.</w:t>
+        <w:t>Kiến trúc ReAct (Reasoning and Acting) kết hợp giữa suy luận (Reasoning trace) và hành động (Actions). Thay vì chỉ phản hồi tĩnh, Agent tự đánh giá ngữ cảnh, quyết định gọi lần lượt các công cụ độc lập (Tool-Calling) và quan sát kết quả trả về (Observation) để giải quyết các bài toán bảo mật phức tạp mà không bị ảo giác (hallucination).</w:t>
       </w:r>
     </w:p>
     <w:p>
@@ -2083,7 +2167,7 @@
           <w:i w:val="0"/>
           <w:sz w:val="26"/>
         </w:rPr>
-        <w:t>Hệ thống được thiết kế theo mô hình Single-Agent tích hợp Hộp công cụ Bảo mật (Security Toolbox). Mô hình này loại bỏ hoàn toàn nguy cơ vòng lặp vô tận (infinite loop) và sự phân tán ngữ cảnh của hệ thống Multi-Agent, đảm bảo 100% tính tất định và ổn định.</w:t>
+        <w:t>Hệ thống được thiết kế theo mô hình Single-Agent tích hợp Hộp công cụ Bảo mật (Security Toolbox). Mô hình này loại bỏ hoàn toàn nguy cơ vòng lặp vô tận (infinite loop) và sự phân tán ngữ cảnh của hệ thống Multi-Agent, đảm bảo 100% tính tất định và ổn định trong quá trình vận hành.</w:t>
       </w:r>
     </w:p>
     <w:p>

</xml_diff>

<commit_message>
docs: Tinh chinh bao cao HUTECH: bo so lieu gia dinh va danh muc hinh trong, dong bo nhom 3 SV
</commit_message>
<xml_diff>
--- a/docs/BAO_CAO_DO_AN_HUTECH.docx
+++ b/docs/BAO_CAO_DO_AN_HUTECH.docx
@@ -120,7 +120,7 @@
       <w:tr>
         <w:tc>
           <w:tcPr>
-            <w:tcW w:type="dxa" w:w="4536"/>
+            <w:tcW w:type="dxa" w:w="4320"/>
           </w:tcPr>
           <w:p>
             <w:pPr>
@@ -138,7 +138,7 @@
         </w:tc>
         <w:tc>
           <w:tcPr>
-            <w:tcW w:type="dxa" w:w="4536"/>
+            <w:tcW w:type="dxa" w:w="4320"/>
           </w:tcPr>
           <w:p>
             <w:pPr>
@@ -157,7 +157,7 @@
       <w:tr>
         <w:tc>
           <w:tcPr>
-            <w:tcW w:type="dxa" w:w="4536"/>
+            <w:tcW w:type="dxa" w:w="4320"/>
           </w:tcPr>
           <w:p>
             <w:pPr>
@@ -175,7 +175,7 @@
         </w:tc>
         <w:tc>
           <w:tcPr>
-            <w:tcW w:type="dxa" w:w="4536"/>
+            <w:tcW w:type="dxa" w:w="4320"/>
           </w:tcPr>
           <w:p>
             <w:pPr>
@@ -194,7 +194,7 @@
       <w:tr>
         <w:tc>
           <w:tcPr>
-            <w:tcW w:type="dxa" w:w="4536"/>
+            <w:tcW w:type="dxa" w:w="4320"/>
           </w:tcPr>
           <w:p>
             <w:pPr>
@@ -204,7 +204,7 @@
         </w:tc>
         <w:tc>
           <w:tcPr>
-            <w:tcW w:type="dxa" w:w="4536"/>
+            <w:tcW w:type="dxa" w:w="4320"/>
           </w:tcPr>
           <w:p>
             <w:pPr>
@@ -223,7 +223,7 @@
       <w:tr>
         <w:tc>
           <w:tcPr>
-            <w:tcW w:type="dxa" w:w="4536"/>
+            <w:tcW w:type="dxa" w:w="4320"/>
           </w:tcPr>
           <w:p>
             <w:pPr>
@@ -233,7 +233,7 @@
         </w:tc>
         <w:tc>
           <w:tcPr>
-            <w:tcW w:type="dxa" w:w="4536"/>
+            <w:tcW w:type="dxa" w:w="4320"/>
           </w:tcPr>
           <w:p>
             <w:pPr>
@@ -252,7 +252,7 @@
       <w:tr>
         <w:tc>
           <w:tcPr>
-            <w:tcW w:type="dxa" w:w="4536"/>
+            <w:tcW w:type="dxa" w:w="4320"/>
           </w:tcPr>
           <w:p>
             <w:pPr>
@@ -270,7 +270,7 @@
         </w:tc>
         <w:tc>
           <w:tcPr>
-            <w:tcW w:type="dxa" w:w="4536"/>
+            <w:tcW w:type="dxa" w:w="4320"/>
           </w:tcPr>
           <w:p>
             <w:pPr>
@@ -289,7 +289,7 @@
       <w:tr>
         <w:tc>
           <w:tcPr>
-            <w:tcW w:type="dxa" w:w="4536"/>
+            <w:tcW w:type="dxa" w:w="4320"/>
           </w:tcPr>
           <w:p>
             <w:pPr>
@@ -307,7 +307,7 @@
         </w:tc>
         <w:tc>
           <w:tcPr>
-            <w:tcW w:type="dxa" w:w="4536"/>
+            <w:tcW w:type="dxa" w:w="4320"/>
           </w:tcPr>
           <w:p>
             <w:pPr>
@@ -346,7 +346,7 @@
     </w:p>
     <w:p>
       <w:pPr>
-        <w:spacing w:before="280" w:after="160" w:line="360" w:lineRule="auto"/>
+        <w:spacing w:before="320" w:after="160" w:line="360" w:lineRule="auto"/>
         <w:jc w:val="center"/>
       </w:pPr>
       <w:r>
@@ -371,7 +371,7 @@
           <w:i w:val="0"/>
           <w:sz w:val="26"/>
         </w:rPr>
-        <w:t>Nhóm sinh viên thực hiện xin cam đoan đây là công trình nghiên cứu và báo cáo đồ án do chính các thành viên trong nhóm thực hiện dưới sự hướng dẫn khoa học của Giảng viên hướng dẫn – ThS. Đinh Phương Nam. Các nội dung nghiên cứu lý thuyết, phương pháp kỹ thuật, mã nguồn phần mềm và kết quả đo lường thực nghiệm được trình bày trong báo cáo này là hoàn toàn trung thực, khách quan và chưa từng được công bố trong bất kỳ công trình đồ án hay khóa luận nào khác.</w:t>
+        <w:t>Nhóm sinh viên thực hiện xin cam đoan đây là công trình nghiên cứu và báo cáo đồ án do chính các thành viên trong nhóm thực hiện dưới sự hướng dẫn khoa học của Giảng viên hướng dẫn – ThS. Đinh Phương Nam. Các nội dung nghiên cứu lý thuyết, phương pháp kỹ thuật, mã nguồn phần mềm và các đánh giá thực nghiệm được trình bày trong báo cáo này là hoàn toàn trung thực, khách quan và không sao chép từ bất kỳ công trình nào khác.</w:t>
       </w:r>
     </w:p>
     <w:p>
@@ -433,7 +433,7 @@
       <w:tr>
         <w:tc>
           <w:tcPr>
-            <w:tcW w:type="dxa" w:w="3024"/>
+            <w:tcW w:type="dxa" w:w="2880"/>
           </w:tcPr>
           <w:p>
             <w:pPr>
@@ -451,7 +451,7 @@
         </w:tc>
         <w:tc>
           <w:tcPr>
-            <w:tcW w:type="dxa" w:w="3024"/>
+            <w:tcW w:type="dxa" w:w="2880"/>
           </w:tcPr>
           <w:p>
             <w:pPr>
@@ -469,7 +469,7 @@
         </w:tc>
         <w:tc>
           <w:tcPr>
-            <w:tcW w:type="dxa" w:w="3024"/>
+            <w:tcW w:type="dxa" w:w="2880"/>
           </w:tcPr>
           <w:p>
             <w:pPr>
@@ -494,7 +494,7 @@
     </w:p>
     <w:p>
       <w:pPr>
-        <w:spacing w:before="280" w:after="160" w:line="360" w:lineRule="auto"/>
+        <w:spacing w:before="320" w:after="160" w:line="360" w:lineRule="auto"/>
         <w:jc w:val="center"/>
       </w:pPr>
       <w:r>
@@ -519,7 +519,7 @@
           <w:i w:val="0"/>
           <w:sz w:val="26"/>
         </w:rPr>
-        <w:t>Để hoàn thành đồ án này, nhóm sinh viên thực hiện xin bày tỏ lòng biết ơn sâu sắc và chân thành nhất đến quý Thầy Cô Khoa Công nghệ Thông tin, Trường Đại học Công nghệ TP.HCM (HUTECH) đã tận tình truyền đạt những kiến thức chuyên môn nền tảng vững chắc và phương pháp nghiên cứu khoa học quý báu trong suốt quá trình học tập và rèn luyện tại trường.</w:t>
+        <w:t>Để hoàn thành đồ án này, nhóm sinh viên thực hiện xin bày tỏ lòng biết ơn sâu sắc và chân thành nhất đến quý Thầy Cô Khoa Công nghệ Thông tin, Trường Đại học Công nghệ TP.HCM (HUTECH) đã tận tình truyền đạt những kiến thức chuyên môn nền tảng vững chắc và phương pháp nghiên cứu khoa học quý báu trong suốt quá trình học tập tại trường.</w:t>
       </w:r>
     </w:p>
     <w:p>
@@ -534,7 +534,7 @@
           <w:i w:val="0"/>
           <w:sz w:val="26"/>
         </w:rPr>
-        <w:t>Đặc biệt, nhóm xin gửi lời cảm ơn trân trọng nhất đến Thầy ThS. Đinh Phương Nam, người đã trực tiếp định hướng đề tài, tận tình góp ý chuyên môn sâu sát và luôn động viên, hỗ trợ nhóm tháo gỡ các vướng mắc kỹ thuật trong suốt quá trình nghiên cứu và hiện thực hóa hệ thống.</w:t>
+        <w:t>Đặc biệt, nhóm xin gửi lời cảm ơn trân trọng nhất đến Thầy ThS. Đinh Phương Nam, người đã trực tiếp định hướng đề tài, tận tình góp ý chuyên môn sâu sát và luôn hỗ trợ nhóm tháo gỡ các vướng mắc kỹ thuật trong suốt quá trình nghiên cứu và hiện thực hóa hệ thống.</w:t>
       </w:r>
     </w:p>
     <w:p>
@@ -549,7 +549,7 @@
           <w:i w:val="0"/>
           <w:sz w:val="26"/>
         </w:rPr>
-        <w:t>Mặc dù đã nỗ lực hết sức để hoàn thiện báo cáo một cách toàn diện và khoa học nhất, song do giới hạn về mặt thời gian và kinh nghiệm thực tiễn, đề tài khó tránh khỏi những thiếu sót nhất định. Nhóm sinh viên thực hiện rất mong nhận được những ý kiến đóng góp, chỉ bảo quý báu từ quý Thầy Cô trong Hội đồng chấm thi để công trình ngày càng hoàn thiện hơn và có tính ứng dụng thực tiễn cao hơn.</w:t>
+        <w:t>Mặc dù đã nỗ lực hết sức để hoàn thiện báo cáo một cách toàn diện và khoa học nhất, song do giới hạn về mặt thời gian và kinh nghiệm thực tiễn, đề tài khó tránh khỏi những thiếu sót nhất định. Nhóm sinh viên thực hiện rất mong nhận được những ý kiến đóng góp quý báu từ quý Thầy Cô trong Hội đồng chấm thi để công trình ngày càng hoàn thiện hơn.</w:t>
       </w:r>
     </w:p>
     <w:p>
@@ -559,7 +559,7 @@
     </w:p>
     <w:p>
       <w:pPr>
-        <w:spacing w:before="280" w:after="160" w:line="360" w:lineRule="auto"/>
+        <w:spacing w:before="320" w:after="160" w:line="360" w:lineRule="auto"/>
         <w:jc w:val="center"/>
       </w:pPr>
       <w:r>
@@ -653,25 +653,6 @@
       <w:r>
         <w:rPr>
           <w:rFonts w:ascii="Times New Roman" w:hAnsi="Times New Roman"/>
-          <w:sz w:val="24"/>
-        </w:rPr>
-        <w:t xml:space="preserve">DANH MỤC HÌNH ẢNH &amp; BẢNG BIỂU                                         </w:t>
-      </w:r>
-      <w:r>
-        <w:rPr>
-          <w:rFonts w:ascii="Times New Roman" w:hAnsi="Times New Roman"/>
-          <w:sz w:val="24"/>
-        </w:rPr>
-        <w:t xml:space="preserve">         v</w:t>
-      </w:r>
-    </w:p>
-    <w:p>
-      <w:pPr>
-        <w:spacing w:line="288" w:lineRule="auto" w:before="20" w:after="20"/>
-      </w:pPr>
-      <w:r>
-        <w:rPr>
-          <w:rFonts w:ascii="Times New Roman" w:hAnsi="Times New Roman"/>
           <w:b/>
           <w:sz w:val="24"/>
         </w:rPr>
@@ -885,7 +866,7 @@
           <w:rFonts w:ascii="Times New Roman" w:hAnsi="Times New Roman"/>
           <w:sz w:val="24"/>
         </w:rPr>
-        <w:t xml:space="preserve">  2.6. Các dịch vụ thẩm định danh tiếng mối đe dọa (VirusTotal, AbuseIPDB)</w:t>
+        <w:t xml:space="preserve">  2.6. Các dịch vụ thẩm định danh tiếng mối đe dọa trực tuyến         </w:t>
       </w:r>
       <w:r>
         <w:rPr>
@@ -1020,7 +1001,7 @@
           <w:b/>
           <w:sz w:val="24"/>
         </w:rPr>
-        <w:t xml:space="preserve">CHƯƠNG 4: KẾT QUẢ THỰC NGHIỆM VÀ BÀN LUẬN                             </w:t>
+        <w:t xml:space="preserve">CHƯƠNG 4: KẾT QUẢ VÀ BÀN LUẬN                                         </w:t>
       </w:r>
       <w:r>
         <w:rPr>
@@ -1039,7 +1020,7 @@
           <w:rFonts w:ascii="Times New Roman" w:hAnsi="Times New Roman"/>
           <w:sz w:val="24"/>
         </w:rPr>
-        <w:t xml:space="preserve">  4.1. Môi trường Thực nghiệm và Tập dữ liệu Benchmark 30 APT         </w:t>
+        <w:t xml:space="preserve">  4.1. Môi trường Thực nghiệm và Dữ liệu Kiểm thử                     </w:t>
       </w:r>
       <w:r>
         <w:rPr>
@@ -1058,7 +1039,7 @@
           <w:rFonts w:ascii="Times New Roman" w:hAnsi="Times New Roman"/>
           <w:sz w:val="24"/>
         </w:rPr>
-        <w:t xml:space="preserve">  4.2. Đánh giá Độ chính xác Trích xuất IOC và Ánh xạ MITRE ATT&amp;CK    </w:t>
+        <w:t xml:space="preserve">  4.2. Đánh giá Khả năng Trích xuất IOC và Ánh xạ MITRE ATT&amp;CK        </w:t>
       </w:r>
       <w:r>
         <w:rPr>
@@ -1172,264 +1153,7 @@
     </w:p>
     <w:p>
       <w:pPr>
-        <w:spacing w:before="280" w:after="160" w:line="360" w:lineRule="auto"/>
-        <w:jc w:val="center"/>
-      </w:pPr>
-      <w:r>
-        <w:rPr>
-          <w:rFonts w:ascii="Times New Roman" w:hAnsi="Times New Roman"/>
-          <w:b/>
-          <w:i w:val="0"/>
-          <w:sz w:val="28"/>
-        </w:rPr>
-        <w:t>DANH MỤC HÌNH ẢNH &amp; BẢNG BIỂU</w:t>
-      </w:r>
-    </w:p>
-    <w:p>
-      <w:pPr>
-        <w:spacing w:before="200" w:after="80" w:line="360" w:lineRule="auto"/>
-        <w:jc w:val="left"/>
-      </w:pPr>
-      <w:r>
-        <w:rPr>
-          <w:rFonts w:ascii="Times New Roman" w:hAnsi="Times New Roman"/>
-          <w:b/>
-          <w:i w:val="0"/>
-          <w:sz w:val="26"/>
-        </w:rPr>
-        <w:t>Danh mục Hình ảnh:</w:t>
-      </w:r>
-    </w:p>
-    <w:p>
-      <w:pPr>
-        <w:pStyle w:val="ListParagraph"/>
-        <w:spacing w:before="0" w:after="60" w:line="312" w:lineRule="auto"/>
-        <w:ind w:left="360"/>
-        <w:jc w:val="both"/>
-      </w:pPr>
-      <w:r>
-        <w:rPr>
-          <w:rFonts w:ascii="Times New Roman" w:hAnsi="Times New Roman"/>
-          <w:b/>
-          <w:sz w:val="26"/>
-        </w:rPr>
-        <w:t xml:space="preserve">• </w:t>
-      </w:r>
-      <w:r>
-        <w:rPr>
-          <w:rFonts w:ascii="Times New Roman" w:hAnsi="Times New Roman"/>
-          <w:sz w:val="26"/>
-        </w:rPr>
-        <w:t>Hình 1.1. Vòng lặp suy luận ReAct (Reasoning - Action - Observation)</w:t>
-      </w:r>
-    </w:p>
-    <w:p>
-      <w:pPr>
-        <w:pStyle w:val="ListParagraph"/>
-        <w:spacing w:before="0" w:after="60" w:line="312" w:lineRule="auto"/>
-        <w:ind w:left="360"/>
-        <w:jc w:val="both"/>
-      </w:pPr>
-      <w:r>
-        <w:rPr>
-          <w:rFonts w:ascii="Times New Roman" w:hAnsi="Times New Roman"/>
-          <w:b/>
-          <w:sz w:val="26"/>
-        </w:rPr>
-        <w:t xml:space="preserve">• </w:t>
-      </w:r>
-      <w:r>
-        <w:rPr>
-          <w:rFonts w:ascii="Times New Roman" w:hAnsi="Times New Roman"/>
-          <w:sz w:val="26"/>
-        </w:rPr>
-        <w:t>Hình 3.1. Sơ đồ kiến trúc hệ thống Single-Agent tích hợp Security Toolbox</w:t>
-      </w:r>
-    </w:p>
-    <w:p>
-      <w:pPr>
-        <w:pStyle w:val="ListParagraph"/>
-        <w:spacing w:before="0" w:after="60" w:line="312" w:lineRule="auto"/>
-        <w:ind w:left="360"/>
-        <w:jc w:val="both"/>
-      </w:pPr>
-      <w:r>
-        <w:rPr>
-          <w:rFonts w:ascii="Times New Roman" w:hAnsi="Times New Roman"/>
-          <w:b/>
-          <w:sz w:val="26"/>
-        </w:rPr>
-        <w:t xml:space="preserve">• </w:t>
-      </w:r>
-      <w:r>
-        <w:rPr>
-          <w:rFonts w:ascii="Times New Roman" w:hAnsi="Times New Roman"/>
-          <w:sz w:val="26"/>
-        </w:rPr>
-        <w:t>Hình 3.2. Sơ đồ tuần tự xử lý bài báo cáo CTI tự động</w:t>
-      </w:r>
-    </w:p>
-    <w:p>
-      <w:pPr>
-        <w:pStyle w:val="ListParagraph"/>
-        <w:spacing w:before="0" w:after="60" w:line="312" w:lineRule="auto"/>
-        <w:ind w:left="360"/>
-        <w:jc w:val="both"/>
-      </w:pPr>
-      <w:r>
-        <w:rPr>
-          <w:rFonts w:ascii="Times New Roman" w:hAnsi="Times New Roman"/>
-          <w:b/>
-          <w:sz w:val="26"/>
-        </w:rPr>
-        <w:t xml:space="preserve">• </w:t>
-      </w:r>
-      <w:r>
-        <w:rPr>
-          <w:rFonts w:ascii="Times New Roman" w:hAnsi="Times New Roman"/>
-          <w:sz w:val="26"/>
-        </w:rPr>
-        <w:t>Hình 4.1. Giao diện Web Dashboard hiển thị luồng suy luận của AI Agent</w:t>
-      </w:r>
-    </w:p>
-    <w:p>
-      <w:pPr>
-        <w:pStyle w:val="ListParagraph"/>
-        <w:spacing w:before="0" w:after="60" w:line="312" w:lineRule="auto"/>
-        <w:ind w:left="360"/>
-        <w:jc w:val="both"/>
-      </w:pPr>
-      <w:r>
-        <w:rPr>
-          <w:rFonts w:ascii="Times New Roman" w:hAnsi="Times New Roman"/>
-          <w:b/>
-          <w:sz w:val="26"/>
-        </w:rPr>
-        <w:t xml:space="preserve">• </w:t>
-      </w:r>
-      <w:r>
-        <w:rPr>
-          <w:rFonts w:ascii="Times New Roman" w:hAnsi="Times New Roman"/>
-          <w:sz w:val="26"/>
-        </w:rPr>
-        <w:t>Hình 4.2. Biểu đồ so sánh thời gian xử lý sự cố thủ công và tự động</w:t>
-      </w:r>
-    </w:p>
-    <w:p>
-      <w:pPr>
-        <w:spacing w:before="200" w:after="80" w:line="360" w:lineRule="auto"/>
-        <w:jc w:val="left"/>
-      </w:pPr>
-      <w:r>
-        <w:rPr>
-          <w:rFonts w:ascii="Times New Roman" w:hAnsi="Times New Roman"/>
-          <w:b/>
-          <w:i w:val="0"/>
-          <w:sz w:val="26"/>
-        </w:rPr>
-        <w:t>Danh mục Bảng biểu:</w:t>
-      </w:r>
-    </w:p>
-    <w:p>
-      <w:pPr>
-        <w:pStyle w:val="ListParagraph"/>
-        <w:spacing w:before="0" w:after="60" w:line="312" w:lineRule="auto"/>
-        <w:ind w:left="360"/>
-        <w:jc w:val="both"/>
-      </w:pPr>
-      <w:r>
-        <w:rPr>
-          <w:rFonts w:ascii="Times New Roman" w:hAnsi="Times New Roman"/>
-          <w:b/>
-          <w:sz w:val="26"/>
-        </w:rPr>
-        <w:t xml:space="preserve">• </w:t>
-      </w:r>
-      <w:r>
-        <w:rPr>
-          <w:rFonts w:ascii="Times New Roman" w:hAnsi="Times New Roman"/>
-          <w:sz w:val="26"/>
-        </w:rPr>
-        <w:t>Bảng 1.1. So sánh chuẩn TLP trong phân loại dữ liệu tình báo</w:t>
-      </w:r>
-    </w:p>
-    <w:p>
-      <w:pPr>
-        <w:pStyle w:val="ListParagraph"/>
-        <w:spacing w:before="0" w:after="60" w:line="312" w:lineRule="auto"/>
-        <w:ind w:left="360"/>
-        <w:jc w:val="both"/>
-      </w:pPr>
-      <w:r>
-        <w:rPr>
-          <w:rFonts w:ascii="Times New Roman" w:hAnsi="Times New Roman"/>
-          <w:b/>
-          <w:sz w:val="26"/>
-        </w:rPr>
-        <w:t xml:space="preserve">• </w:t>
-      </w:r>
-      <w:r>
-        <w:rPr>
-          <w:rFonts w:ascii="Times New Roman" w:hAnsi="Times New Roman"/>
-          <w:sz w:val="26"/>
-        </w:rPr>
-        <w:t>Bảng 3.1. Bảng đặc tả 8 công cụ chuyên dụng trong Security Toolbox</w:t>
-      </w:r>
-    </w:p>
-    <w:p>
-      <w:pPr>
-        <w:pStyle w:val="ListParagraph"/>
-        <w:spacing w:before="0" w:after="60" w:line="312" w:lineRule="auto"/>
-        <w:ind w:left="360"/>
-        <w:jc w:val="both"/>
-      </w:pPr>
-      <w:r>
-        <w:rPr>
-          <w:rFonts w:ascii="Times New Roman" w:hAnsi="Times New Roman"/>
-          <w:b/>
-          <w:sz w:val="26"/>
-        </w:rPr>
-        <w:t xml:space="preserve">• </w:t>
-      </w:r>
-      <w:r>
-        <w:rPr>
-          <w:rFonts w:ascii="Times New Roman" w:hAnsi="Times New Roman"/>
-          <w:sz w:val="26"/>
-        </w:rPr>
-        <w:t>Bảng 4.1. Bảng đánh giá độ chính xác (Precision, Recall, F1) trên tập benchmark</w:t>
-      </w:r>
-    </w:p>
-    <w:p>
-      <w:pPr>
-        <w:pStyle w:val="ListParagraph"/>
-        <w:spacing w:before="0" w:after="60" w:line="312" w:lineRule="auto"/>
-        <w:ind w:left="360"/>
-        <w:jc w:val="both"/>
-      </w:pPr>
-      <w:r>
-        <w:rPr>
-          <w:rFonts w:ascii="Times New Roman" w:hAnsi="Times New Roman"/>
-          <w:b/>
-          <w:sz w:val="26"/>
-        </w:rPr>
-        <w:t xml:space="preserve">• </w:t>
-      </w:r>
-      <w:r>
-        <w:rPr>
-          <w:rFonts w:ascii="Times New Roman" w:hAnsi="Times New Roman"/>
-          <w:sz w:val="26"/>
-        </w:rPr>
-        <w:t>Bảng 4.2. Bảng kết quả kiểm tra tính hợp lệ của quy tắc Sigma bằng sigma-cli</w:t>
-      </w:r>
-    </w:p>
-    <w:p>
-      <w:r>
-        <w:br w:type="page"/>
-      </w:r>
-    </w:p>
-    <w:p>
-      <w:pPr>
-        <w:spacing w:before="280" w:after="160" w:line="360" w:lineRule="auto"/>
+        <w:spacing w:before="320" w:after="160" w:line="360" w:lineRule="auto"/>
         <w:jc w:val="center"/>
       </w:pPr>
       <w:r>
@@ -1469,7 +1193,7 @@
           <w:i w:val="0"/>
           <w:sz w:val="26"/>
         </w:rPr>
-        <w:t>Trong kỷ nguyên số hóa mạnh mẽ hiện nay, không gian mạng chứng kiến sự gia tăng đột biến của các chiến dịch tấn công có chủ đích (Advanced Persistent Threat - APT), mã độc tống tiền (Ransomware) và khai thác lỗ hổng nghiêm trọng. Hằng ngày, hàng nghìn báo cáo kỹ thuật được công bố từ các cơ quan chính phủ và các tập đoàn công nghệ lớn. Trước tình hình đó, các Trung tâm Điều hành An ninh mạng (SOC) đối mặt với thách thức quá tải nghiêm trọng về dữ liệu tình báo mối đe dọa mạng (Cyber Threat Intelligence - CTI).</w:t>
+        <w:t>Trong kỷ nguyên số hóa mạnh mẽ hiện nay, không gian mạng chứng kiến sự gia tăng đột biến của các chiến dịch tấn công có chủ đích (Advanced Persistent Threat - APT), mã độc tống tiền (Ransomware) và khai thác lỗ hổng nghiêm trọng nhắm vào hạ tầng thông tin trọng yếu. Hằng ngày, hàng nghìn báo cáo kỹ thuật được công bố từ các cơ quan chính phủ và các hãng bảo mật lớn trên thế giới. Trước tình hình đó, các Trung tâm Điều hành An ninh mạng (SOC) đối mặt với thách thức quá tải nghiêm trọng về dữ liệu tình báo mối đe dọa mạng (Cyber Threat Intelligence - CTI).</w:t>
       </w:r>
     </w:p>
     <w:p>
@@ -1484,7 +1208,7 @@
           <w:i w:val="0"/>
           <w:sz w:val="26"/>
         </w:rPr>
-        <w:t>Quy trình xử lý CTI truyền thống mang tính thủ công cao: chuyên viên phân tích (SOC Analyst) phải đọc từng bài báo dài hàng nghìn từ, ghi chép lại các chỉ số xâm nhập (IOCs: IP, Domain, Hash, CVE), kiểm tra thủ công trên VirusTotal, AbuseIPDB và tự viết các quy tắc phát hiện (Sigma, YARA, Firewall blocklist). Quá trình này tiêu tốn từ 1 đến 3 giờ cho mỗi sự cố, gây ra hiện tượng kiệt quệ cảnh báo (SOC alert fatigue) và làm chậm trễ đáng kể khả năng phản ứng trước các đòn tấn công tốc độ cao của tin tặc.</w:t>
+        <w:t>Quy trình xử lý CTI truyền thống mang tính thủ công cao: chuyên viên phân tích (SOC Analyst) phải đọc từng bài báo dài hàng nghìn từ, ghi chép lại các chỉ số xâm nhập (IOCs: IP, Domain, Hash, CVE), kiểm tra thủ công trên VirusTotal, AbuseIPDB và tự viết các quy tắc phát hiện (Sigma, YARA, Firewall blocklist). Quá trình này tiêu tốn nhiều giờ làm việc cho mỗi sự cố, gây ra hiện tượng kiệt quệ cảnh báo (SOC alert fatigue) và làm chậm trễ đáng kể khả năng phản ứng trước các đòn tấn công tốc độ cao của tin tặc.</w:t>
       </w:r>
     </w:p>
     <w:p>
@@ -1499,7 +1223,7 @@
           <w:i w:val="0"/>
           <w:sz w:val="26"/>
         </w:rPr>
-        <w:t>Sự phát triển đột phá của Trí tuệ Nhân tạo Tự chủ (AI Agent) kết hợp cùng mô hình suy luận ReAct (Reasoning - Action - Observation) và cơ chế gọi công cụ (Tool-Calling) mở ra cơ hội tự động hóa toàn diện chu trình CTI. Việc xây dựng một hệ thống AI Agent có khả năng tự động đọc báo cáo nguồn mở (OSINT), làm giàu dữ liệu, ánh xạ kỹ thuật tấn công theo ma trận MITRE ATT&amp;CK và sinh luật phòng thủ tự động trong vòng vài chục giây là giải pháp mang tính đột phá và cấp thiết, giúp chuyển hóa tri thức tình báo thành hành động phòng thủ thực chiến (Actionable Defense) bảo vệ hệ thống thông tin.</w:t>
+        <w:t>Sự phát triển đột phá của Trí tuệ Nhân tạo Tự chủ (AI Agent) kết hợp cùng mô hình suy luận ReAct (Reasoning - Action - Observation) và cơ chế gọi công cụ (Tool-Calling) mở ra cơ hội tự động hóa toàn diện chu trình CTI. Việc nghiên cứu và hiện thực hóa một hệ thống AI Agent có khả năng tự động đọc báo cáo nguồn mở (OSINT), làm giàu dữ liệu, ánh xạ kỹ thuật tấn công theo ma trận MITRE ATT&amp;CK và sinh luật phòng thủ tự động trong thời gian thực là giải pháp mang tính đột phá và cấp thiết, giúp chuyển hóa tri thức tình báo thành hành động phòng thủ thực chiến (Actionable Defense) bảo vệ hệ thống thông tin.</w:t>
       </w:r>
     </w:p>
     <w:p>
@@ -1613,7 +1337,7 @@
           <w:rFonts w:ascii="Times New Roman" w:hAnsi="Times New Roman"/>
           <w:sz w:val="26"/>
         </w:rPr>
-        <w:t>Xây dựng công cụ trích xuất chuẩn hóa IOCs (IP, Domain, URL, MD5, SHA256, CVE) kết hợp giữa Regex và mô hình ngôn ngữ lớn (LLM).</w:t>
+        <w:t>Xây dựng công cụ trích xuất chuẩn hóa IOCs (IP, Domain, URL, MD5, SHA256, CVE) kết hợp giữa biểu thức chính quy (Regex) và mô hình ngôn ngữ lớn (LLM).</w:t>
       </w:r>
     </w:p>
     <w:p>
@@ -1705,7 +1429,7 @@
           <w:rFonts w:ascii="Times New Roman" w:hAnsi="Times New Roman"/>
           <w:sz w:val="26"/>
         </w:rPr>
-        <w:t>Đánh giá thực nghiệm độ chính xác (Precision, Recall, F1-Score) trên tập dữ liệu benchmark gồm 30 báo cáo chiến dịch APT thực tế.</w:t>
+        <w:t>Xây dựng phương pháp đánh giá thực nghiệm khoa học nhằm kiểm thử tính hiệu quả và độ ổn định của hệ thống trên tập dữ liệu báo cáo APT thực tế.</w:t>
       </w:r>
     </w:p>
     <w:p>
@@ -1765,7 +1489,22 @@
           <w:i w:val="0"/>
           <w:sz w:val="26"/>
         </w:rPr>
-        <w:t>• Phạm vi công nghệ: Python 3.10+, LangChain, ReAct Tool-Calling, Gemini/Groq LLM APIs, VirusTotal API, AbuseIPDB API, OASIS STIX 2.1, FastAPI, SQLite, Docker.</w:t>
+        <w:t>• Phạm vi công nghệ: Ngôn ngữ Python 3.10+, LangChain, cơ chế Tool-Calling / ReAct kết nối qua LLM APIs (Gemini Flash / Groq LLMs), VirusTotal API, AbuseIPDB API, OASIS STIX 2.1, FastAPI, SQLite, Docker.</w:t>
+      </w:r>
+    </w:p>
+    <w:p>
+      <w:pPr>
+        <w:spacing w:before="0" w:after="120" w:line="360" w:lineRule="auto"/>
+        <w:jc w:val="both"/>
+      </w:pPr>
+      <w:r>
+        <w:rPr>
+          <w:rFonts w:ascii="Times New Roman" w:hAnsi="Times New Roman"/>
+          <w:b w:val="0"/>
+          <w:i w:val="0"/>
+          <w:sz w:val="26"/>
+        </w:rPr>
+        <w:t>• Phạm vi ứng dụng: Hệ thống hỗ trợ tự động hóa mức SOC L1/L2, hoạt động theo cơ chế chuyên viên phê duyệt (Human-in-the-loop) để thẩm định quy tắc trước khi áp dụng vào thiết bị mạng thực tế.</w:t>
       </w:r>
     </w:p>
     <w:p>
@@ -1887,7 +1626,7 @@
           <w:rFonts w:ascii="Times New Roman" w:hAnsi="Times New Roman"/>
           <w:sz w:val="26"/>
         </w:rPr>
-        <w:t>Phòng ngừa chặn nhầm: Thiết lập Danh sách trắng (Whitelist) và áp dụng cơ chế chuyên viên phê duyệt (Human-in-the-loop).</w:t>
+        <w:t>Phòng ngừa chặn nhầm: Thiết lập Danh sách trắng (Whitelist) cho hạ tầng công cộng và áp dụng cơ chế chuyên viên phê duyệt.</w:t>
       </w:r>
     </w:p>
     <w:p>
@@ -1897,7 +1636,7 @@
     </w:p>
     <w:p>
       <w:pPr>
-        <w:spacing w:before="280" w:after="160" w:line="360" w:lineRule="auto"/>
+        <w:spacing w:before="320" w:after="160" w:line="360" w:lineRule="auto"/>
         <w:jc w:val="center"/>
       </w:pPr>
       <w:r>
@@ -2027,7 +1766,7 @@
           <w:i w:val="0"/>
           <w:sz w:val="26"/>
         </w:rPr>
-        <w:t>• Sigma Rules: Là định dạng chữ ký mở chuẩn YAML độc lập với nền tảng, dùng để mô tả các quy tắc phát hiện trên nhật ký sự kiện máy chủ và nạp vào SIEM (Wazuh, Splunk, Elastic SIEM).</w:t>
+        <w:t>• Sigma Rules: Định dạng chữ ký mở chuẩn YAML độc lập với nền tảng, dùng để mô tả các quy tắc phát hiện trên nhật ký sự kiện máy chủ và nạp vào SIEM (Wazuh, Splunk, Elastic SIEM).</w:t>
       </w:r>
     </w:p>
     <w:p>
@@ -2042,7 +1781,7 @@
           <w:i w:val="0"/>
           <w:sz w:val="26"/>
         </w:rPr>
-        <w:t>• YARA Rules: Là công cụ và chuẩn định dạng nhận dạng mẫu tệp tin độc hại dựa trên chuỗi văn bản và đặc trưng nhị phân, phục vụ rà quét trên máy trạm (EDR / Antivirus).</w:t>
+        <w:t>• YARA Rules: Công cụ và chuẩn định dạng nhận dạng mẫu tệp tin độc hại dựa trên chuỗi văn bản và đặc trưng nhị phân, phục vụ rà quét trên máy trạm (EDR / Antivirus).</w:t>
       </w:r>
     </w:p>
     <w:p>
@@ -2087,7 +1826,7 @@
           <w:i w:val="0"/>
           <w:sz w:val="26"/>
         </w:rPr>
-        <w:t>Kiến trúc ReAct (Reasoning and Acting) kết hợp giữa suy luận (Reasoning trace) và hành động (Actions). Thay vì chỉ phản hồi tĩnh, Agent tự đánh giá ngữ cảnh, quyết định gọi lần lượt các công cụ độc lập (Tool-Calling) và quan sát kết quả trả về (Observation) để giải quyết các bài toán bảo mật phức tạp mà không bị ảo giác (hallucination).</w:t>
+        <w:t>Kiến trúc ReAct (Reasoning and Acting) kết hợp giữa suy luận (Reasoning trace) và hành động (Actions). Thay vì chỉ phản hồi tĩnh, Agent tự đánh giá ngữ cảnh, quyết định gọi lần lượt các công cụ độc lập (Tool-Calling) và quan sát kết quả trả về (Observation) để giải quyết các bài toán bảo mật phức tạp mà không bị ảo giác.</w:t>
       </w:r>
     </w:p>
     <w:p>
@@ -2102,7 +1841,7 @@
           <w:i w:val="0"/>
           <w:sz w:val="26"/>
         </w:rPr>
-        <w:t>2.6. Các dịch vụ thẩm định danh tiếng mối đe dọa (VirusTotal, AbuseIPDB)</w:t>
+        <w:t>2.6. Các dịch vụ thẩm định danh tiếng mối đe dọa trực tuyến</w:t>
       </w:r>
     </w:p>
     <w:p>
@@ -2127,7 +1866,7 @@
     </w:p>
     <w:p>
       <w:pPr>
-        <w:spacing w:before="280" w:after="160" w:line="360" w:lineRule="auto"/>
+        <w:spacing w:before="320" w:after="160" w:line="360" w:lineRule="auto"/>
         <w:jc w:val="center"/>
       </w:pPr>
       <w:r>
@@ -2167,22 +1906,7 @@
           <w:i w:val="0"/>
           <w:sz w:val="26"/>
         </w:rPr>
-        <w:t>Hệ thống được thiết kế theo mô hình Single-Agent tích hợp Hộp công cụ Bảo mật (Security Toolbox). Mô hình này loại bỏ hoàn toàn nguy cơ vòng lặp vô tận (infinite loop) và sự phân tán ngữ cảnh của hệ thống Multi-Agent, đảm bảo 100% tính tất định và ổn định trong quá trình vận hành.</w:t>
-      </w:r>
-    </w:p>
-    <w:p>
-      <w:pPr>
-        <w:spacing w:before="0" w:after="120" w:line="360" w:lineRule="auto"/>
-        <w:jc w:val="both"/>
-      </w:pPr>
-      <w:r>
-        <w:rPr>
-          <w:rFonts w:ascii="Times New Roman" w:hAnsi="Times New Roman"/>
-          <w:b w:val="0"/>
-          <w:i w:val="0"/>
-          <w:sz w:val="26"/>
-        </w:rPr>
-        <w:t>[Chèn ảnh: Hình 3.1 - Sơ đồ kiến trúc hệ thống Single-Agent tích hợp Security Toolbox]</w:t>
+        <w:t>Hệ thống được thiết kế theo mô hình Single-Agent tích hợp Hộp công cụ Bảo mật (Security Toolbox). Mô hình này loại bỏ nguy cơ vòng lặp vô tận (infinite loop) và sự phân tán ngữ cảnh của hệ thống Multi-Agent, đảm bảo tính tất định và độ ổn định cao trong quá trình vận hành.</w:t>
       </w:r>
     </w:p>
     <w:p>
@@ -2460,6 +2184,41 @@
       </w:r>
     </w:p>
     <w:p>
+      <w:r>
+        <w:br w:type="page"/>
+      </w:r>
+    </w:p>
+    <w:p>
+      <w:pPr>
+        <w:spacing w:before="320" w:after="160" w:line="360" w:lineRule="auto"/>
+        <w:jc w:val="center"/>
+      </w:pPr>
+      <w:r>
+        <w:rPr>
+          <w:rFonts w:ascii="Times New Roman" w:hAnsi="Times New Roman"/>
+          <w:b/>
+          <w:i w:val="0"/>
+          <w:sz w:val="28"/>
+        </w:rPr>
+        <w:t>CHƯƠNG 4: KẾT QUẢ VÀ BÀN LUẬN</w:t>
+      </w:r>
+    </w:p>
+    <w:p>
+      <w:pPr>
+        <w:spacing w:before="200" w:after="80" w:line="360" w:lineRule="auto"/>
+        <w:jc w:val="left"/>
+      </w:pPr>
+      <w:r>
+        <w:rPr>
+          <w:rFonts w:ascii="Times New Roman" w:hAnsi="Times New Roman"/>
+          <w:b/>
+          <w:i w:val="0"/>
+          <w:sz w:val="26"/>
+        </w:rPr>
+        <w:t>4.1. Môi trường Thực nghiệm và Dữ liệu Kiểm thử</w:t>
+      </w:r>
+    </w:p>
+    <w:p>
       <w:pPr>
         <w:spacing w:before="0" w:after="120" w:line="360" w:lineRule="auto"/>
         <w:jc w:val="both"/>
@@ -2471,27 +2230,7 @@
           <w:i w:val="0"/>
           <w:sz w:val="26"/>
         </w:rPr>
-        <w:t>[Chèn ảnh: Hình 3.2 - Sơ đồ tuần tự xử lý bài báo cáo CTI tự động]</w:t>
-      </w:r>
-    </w:p>
-    <w:p>
-      <w:r>
-        <w:br w:type="page"/>
-      </w:r>
-    </w:p>
-    <w:p>
-      <w:pPr>
-        <w:spacing w:before="280" w:after="160" w:line="360" w:lineRule="auto"/>
-        <w:jc w:val="center"/>
-      </w:pPr>
-      <w:r>
-        <w:rPr>
-          <w:rFonts w:ascii="Times New Roman" w:hAnsi="Times New Roman"/>
-          <w:b/>
-          <w:i w:val="0"/>
-          <w:sz w:val="28"/>
-        </w:rPr>
-        <w:t>CHƯƠNG 4: KẾT QUẢ THỰC NGHIỆM VÀ BÀN LUẬN</w:t>
+        <w:t>Hệ thống được triển khai thử nghiệm trên môi trường máy trạm phần cứng tiêu chuẩn chạy hệ điều hành Windows/Linux với Python 3.10+. Tập dữ liệu kiểm thử được thu thập từ các báo cáo chiến dịch tấn công APT thực tế được công bố công khai từ các tổ chức bảo mật uy tín.</w:t>
       </w:r>
     </w:p>
     <w:p>
@@ -2506,7 +2245,7 @@
           <w:i w:val="0"/>
           <w:sz w:val="26"/>
         </w:rPr>
-        <w:t>4.1. Môi trường Thực nghiệm và Tập dữ liệu Benchmark 30 APT</w:t>
+        <w:t>4.2. Đánh giá Khả năng Trích xuất IOC và Ánh xạ MITRE ATT&amp;CK</w:t>
       </w:r>
     </w:p>
     <w:p>
@@ -2521,98 +2260,7 @@
           <w:i w:val="0"/>
           <w:sz w:val="26"/>
         </w:rPr>
-        <w:t>Hệ thống được kiểm thử trên môi trường phần cứng chuẩn (CPU Intel Core i7, 16GB RAM) chạy hệ điều hành Windows/Linux với Python 3.10+. Tập dữ liệu kiểm thử gồm 30 báo cáo chiến dịch tấn công APT thực tế được gán nhãn thủ công bởi chuyên gia bảo mật để làm chân lý đối sánh (Ground Truth).</w:t>
-      </w:r>
-    </w:p>
-    <w:p>
-      <w:pPr>
-        <w:spacing w:before="0" w:after="120" w:line="360" w:lineRule="auto"/>
-        <w:jc w:val="both"/>
-      </w:pPr>
-      <w:r>
-        <w:rPr>
-          <w:rFonts w:ascii="Times New Roman" w:hAnsi="Times New Roman"/>
-          <w:b w:val="0"/>
-          <w:i w:val="0"/>
-          <w:sz w:val="26"/>
-        </w:rPr>
-        <w:t>[Chèn ảnh: Hình 4.1 - Giao diện Web Dashboard hiển thị luồng suy luận của AI Agent]</w:t>
-      </w:r>
-    </w:p>
-    <w:p>
-      <w:pPr>
-        <w:spacing w:before="200" w:after="80" w:line="360" w:lineRule="auto"/>
-        <w:jc w:val="left"/>
-      </w:pPr>
-      <w:r>
-        <w:rPr>
-          <w:rFonts w:ascii="Times New Roman" w:hAnsi="Times New Roman"/>
-          <w:b/>
-          <w:i w:val="0"/>
-          <w:sz w:val="26"/>
-        </w:rPr>
-        <w:t>4.2. Đánh giá Độ chính xác Trích xuất IOC và Ánh xạ MITRE ATT&amp;CK</w:t>
-      </w:r>
-    </w:p>
-    <w:p>
-      <w:pPr>
-        <w:spacing w:before="0" w:after="120" w:line="360" w:lineRule="auto"/>
-        <w:jc w:val="both"/>
-      </w:pPr>
-      <w:r>
-        <w:rPr>
-          <w:rFonts w:ascii="Times New Roman" w:hAnsi="Times New Roman"/>
-          <w:b w:val="0"/>
-          <w:i w:val="0"/>
-          <w:sz w:val="26"/>
-        </w:rPr>
-        <w:t>Kết quả đo lường thực nghiệm trên 30 báo cáo cho thấy:</w:t>
-      </w:r>
-    </w:p>
-    <w:p>
-      <w:pPr>
-        <w:pStyle w:val="ListParagraph"/>
-        <w:spacing w:before="0" w:after="60" w:line="312" w:lineRule="auto"/>
-        <w:ind w:left="360"/>
-        <w:jc w:val="both"/>
-      </w:pPr>
-      <w:r>
-        <w:rPr>
-          <w:rFonts w:ascii="Times New Roman" w:hAnsi="Times New Roman"/>
-          <w:b/>
-          <w:sz w:val="26"/>
-        </w:rPr>
-        <w:t xml:space="preserve">• </w:t>
-      </w:r>
-      <w:r>
-        <w:rPr>
-          <w:rFonts w:ascii="Times New Roman" w:hAnsi="Times New Roman"/>
-          <w:sz w:val="26"/>
-        </w:rPr>
-        <w:t>Trích xuất IOCs: Precision đạt 96.4%, Recall đạt 94.2%, F1-Score đạt 95.3% (vượt trội so với Regex thuần túy chỉ đạt F1-Score 78.5% do bị nhiễu dấu câu và phiên bản phần mềm).</w:t>
-      </w:r>
-    </w:p>
-    <w:p>
-      <w:pPr>
-        <w:pStyle w:val="ListParagraph"/>
-        <w:spacing w:before="0" w:after="60" w:line="312" w:lineRule="auto"/>
-        <w:ind w:left="360"/>
-        <w:jc w:val="both"/>
-      </w:pPr>
-      <w:r>
-        <w:rPr>
-          <w:rFonts w:ascii="Times New Roman" w:hAnsi="Times New Roman"/>
-          <w:b/>
-          <w:sz w:val="26"/>
-        </w:rPr>
-        <w:t xml:space="preserve">• </w:t>
-      </w:r>
-      <w:r>
-        <w:rPr>
-          <w:rFonts w:ascii="Times New Roman" w:hAnsi="Times New Roman"/>
-          <w:sz w:val="26"/>
-        </w:rPr>
-        <w:t>Ánh xạ MITRE ATT&amp;CK: Tỷ lệ ánh xạ chính xác kỹ thuật tấn công chính đạt 89.6%.</w:t>
+        <w:t>Hệ thống áp dụng phương pháp đánh giá dựa trên các độ đo khoa học chuẩn trong ngành Xử lý ngôn ngữ tự nhiên và An toàn thông tin bao gồm: Precision (Độ chính xác), Recall (Độ bao phủ) và F1-Score. Việc kết hợp biểu thức chính quy với mô hình ngôn ngữ lớn giúp khắc phục các hạn chế nhận diện sai lệch của phương pháp Regex truyền thống (như nhầm lẫn số hiệu phiên bản phần mềm với địa chỉ IP, hoặc các chuỗi ký tự ngẫu nhiên). Đối với ma trận MITRE ATT&amp;CK, AI Agent thể hiện khả năng nhận diện ngữ cảnh tấn công chính xác và gán đúng các kỹ thuật phổ biến như T1059 (Command and Scripting Interpreter) và T1105 (Ingress Tool Transfer).</w:t>
       </w:r>
     </w:p>
     <w:p>
@@ -2642,7 +2290,7 @@
           <w:i w:val="0"/>
           <w:sz w:val="26"/>
         </w:rPr>
-        <w:t>Toàn bộ quy tắc Sigma do AI sinh ra được kiểm định bằng công cụ tiêu chuẩn sigma-cli: 100% tệp YAML vượt qua kiểm tra cú pháp và có thể biên dịch trực tiếp sang truy vấn tìm kiếm của Wazuh và Splunk. Các quy tắc YARA sinh ra đều quét kiểm thử thành công trên mẫu tệp tin mà không phát sinh lỗi biên dịch.</w:t>
+        <w:t>Toàn bộ quy tắc Sigma do AI sinh ra được kiểm định bằng công cụ tiêu chuẩn sigma-cli: các tệp YAML đều vượt qua kiểm tra cấu trúc cú pháp và có thể biên dịch trực tiếp sang truy vấn tìm kiếm của SIEM (Wazuh, Splunk). Các quy tắc YARA sinh ra đều được xác nhận tính hợp lệ cú pháp của các khối meta, strings và condition, sẵn sàng nạp vào công cụ rà quét endpoint.</w:t>
       </w:r>
     </w:p>
     <w:p>
@@ -2672,22 +2320,7 @@
           <w:i w:val="0"/>
           <w:sz w:val="26"/>
         </w:rPr>
-        <w:t>Thời gian xử lý trung bình toàn trình từ lúc tiếp nhận bài báo cáo đến lúc xuất bản đầy đủ quy tắc phòng thủ chỉ mất 18.6 giây. So với quy trình thủ công của chuyên viên phân tích (trung bình 60 đến 120 phút), hệ thống giúp cắt giảm hơn 99% thời gian phản ứng ban đầu.</w:t>
-      </w:r>
-    </w:p>
-    <w:p>
-      <w:pPr>
-        <w:spacing w:before="0" w:after="120" w:line="360" w:lineRule="auto"/>
-        <w:jc w:val="both"/>
-      </w:pPr>
-      <w:r>
-        <w:rPr>
-          <w:rFonts w:ascii="Times New Roman" w:hAnsi="Times New Roman"/>
-          <w:b w:val="0"/>
-          <w:i w:val="0"/>
-          <w:sz w:val="26"/>
-        </w:rPr>
-        <w:t>[Chèn ảnh: Hình 4.2 - Biểu đồ so sánh thời gian xử lý sự cố thủ công và tự động]</w:t>
+        <w:t>Về mặt thời gian phản ứng, hệ thống tự động hóa hoàn toàn quy trình xử lý từ khi tiếp nhận bài báo cáo đến khi xuất bản trọn bộ quy tắc phòng thủ trong khoảng thời gian tính bằng giây. Điều này tạo ra sự cải thiện vượt bậc so với quy trình rà soát thủ công kéo dài từ 1 đến 3 giờ của chuyên viên phân tích tại các trung tâm SOC.</w:t>
       </w:r>
     </w:p>
     <w:p>
@@ -2717,7 +2350,7 @@
           <w:i w:val="0"/>
           <w:sz w:val="26"/>
         </w:rPr>
-        <w:t>Hệ thống vận hành an toàn tuyệt đối, không ghi nhận trường hợp nghẽn mạng nhờ cơ chế Whitelist bảo vệ hạ tầng công cộng. Mô hình Human-in-the-loop giúp chuyên viên kiểm soát tối đa trước khi triển khai luật vào môi trường mạng sản xuất.</w:t>
+        <w:t>Hệ thống vận hành an toàn, không phát sinh rủi ro gián đoạn mạng nhờ cơ chế Whitelist bảo vệ hạ tầng công cộng. Mô hình Human-in-the-loop giúp chuyên viên kiểm soát tối đa trước khi triển khai luật vào môi trường mạng sản xuất.</w:t>
       </w:r>
     </w:p>
     <w:p>
@@ -2727,7 +2360,7 @@
     </w:p>
     <w:p>
       <w:pPr>
-        <w:spacing w:before="280" w:after="160" w:line="360" w:lineRule="auto"/>
+        <w:spacing w:before="320" w:after="160" w:line="360" w:lineRule="auto"/>
         <w:jc w:val="center"/>
       </w:pPr>
       <w:r>
@@ -2767,7 +2400,7 @@
           <w:i w:val="0"/>
           <w:sz w:val="26"/>
         </w:rPr>
-        <w:t>Đề tài đã nghiên cứu và hiện thực hóa thành công Hệ thống Tình báo Mối đe dọa An ninh mạng Tự chủ dựa trên mô hình Single-Agent tích hợp Security Toolbox. Hệ thống đã giải quyết trọn vẹn bài toán tự động hóa từ thu thập dữ liệu nguồn mở OSINT chuẩn TLP:CLEAR, trích xuất chuẩn hóa IOCs, thẩm định mối đe dọa, ánh xạ kỹ thuật MITRE ATT&amp;CK đến sinh 3 lớp quy tắc phòng thủ thực chiến (Sigma, YARA, Firewall blocklist) trong vòng chưa đầy 20 giây.</w:t>
+        <w:t>Đề tài đã nghiên cứu và hiện thực hóa thành công Hệ thống Tình báo Mối đe dọa An ninh mạng Tự chủ dựa trên mô hình Single-Agent tích hợp Security Toolbox. Hệ thống đã giải quyết trọn vẹn bài toán tự động hóa từ thu thập dữ liệu nguồn mở OSINT chuẩn TLP:CLEAR, trích xuất chuẩn hóa IOCs, thẩm định mối đe dọa, ánh xạ kỹ thuật MITRE ATT&amp;CK đến sinh 3 lớp quy tắc phòng thủ thực chiến (Sigma, YARA, Firewall blocklist).</w:t>
       </w:r>
     </w:p>
     <w:p>
@@ -2797,7 +2430,7 @@
           <w:i w:val="0"/>
           <w:sz w:val="26"/>
         </w:rPr>
-        <w:t>Hệ thống vẫn phụ thuộc vào chất lượng mô tả văn bản của báo cáo nguồn mở; đối với các bài viết có văn phong mơ hồ hoặc sử dụng tiếng lóng hacker mới xuất hiện, độ chính xác của ánh xạ kỹ thuật MITRE ATT&amp;CK có thể bị ảnh hưởng nhẹ.</w:t>
+        <w:t>Hệ thống vẫn phụ thuộc vào chất lượng mô tả văn bản của báo cáo nguồn mở; đối với các bài viết có văn phong mơ hồ hoặc sử dụng tiếng lóng hacker mới xuất hiện, việc phân tích ngữ cảnh của mô hình ngôn ngữ lớn có thể gặp một số thách thức nhất định.</w:t>
       </w:r>
     </w:p>
     <w:p>
@@ -2891,7 +2524,7 @@
     </w:p>
     <w:p>
       <w:pPr>
-        <w:spacing w:before="280" w:after="160" w:line="360" w:lineRule="auto"/>
+        <w:spacing w:before="320" w:after="160" w:line="360" w:lineRule="auto"/>
         <w:jc w:val="center"/>
       </w:pPr>
       <w:r>
@@ -3017,13 +2650,60 @@
       </w:r>
     </w:p>
     <w:sectPr>
+      <w:headerReference w:type="default" r:id="rId9"/>
+      <w:footerReference w:type="default" r:id="rId10"/>
       <w:pgSz w:w="11909" w:h="16834"/>
       <w:pgMar w:top="1138" w:right="1138" w:bottom="1138" w:left="1699" w:header="720" w:footer="720" w:gutter="0"/>
       <w:cols w:space="720"/>
+      <w:titlePg/>
       <w:docGrid w:linePitch="360"/>
     </w:sectPr>
   </w:body>
 </w:document>
+</file>
+
+<file path=word/footer1.xml><?xml version="1.0" encoding="utf-8"?>
+<w:ftr xmlns:m="http://schemas.openxmlformats.org/officeDocument/2006/math" xmlns:mc="http://schemas.openxmlformats.org/markup-compatibility/2006" xmlns:mo="http://schemas.microsoft.com/office/mac/office/2008/main" xmlns:mv="urn:schemas-microsoft-com:mac:vml" xmlns:o="urn:schemas-microsoft-com:office:office" xmlns:r="http://schemas.openxmlformats.org/officeDocument/2006/relationships" xmlns:v="urn:schemas-microsoft-com:vml" xmlns:w10="urn:schemas-microsoft-com:office:word" xmlns:w14="http://schemas.microsoft.com/office/word/2010/wordml" xmlns:w="http://schemas.openxmlformats.org/wordprocessingml/2006/main" xmlns:wne="http://schemas.microsoft.com/office/word/2006/wordml" xmlns:wp14="http://schemas.microsoft.com/office/word/2010/wordprocessingDrawing" xmlns:wp="http://schemas.openxmlformats.org/drawingml/2006/wordprocessingDrawing" xmlns:wpc="http://schemas.microsoft.com/office/word/2010/wordprocessingCanvas" xmlns:wpg="http://schemas.microsoft.com/office/word/2010/wordprocessingGroup" xmlns:wpi="http://schemas.microsoft.com/office/word/2010/wordprocessingInk" xmlns:wps="http://schemas.microsoft.com/office/word/2010/wordprocessingShape" mc:Ignorable="w14 wp14">
+  <w:p>
+    <w:pPr>
+      <w:pStyle w:val="Footer"/>
+      <w:spacing w:before="80" w:after="0"/>
+    </w:pPr>
+    <w:r>
+      <w:rPr>
+        <w:rFonts w:ascii="Times New Roman" w:hAnsi="Times New Roman"/>
+        <w:sz w:val="20"/>
+      </w:rPr>
+      <w:t>SVTH: Nguyễn Nhật Lâm - 2387700036</w:t>
+      <w:tab/>
+      <w:tab/>
+      <w:t>HUTECH 2026</w:t>
+    </w:r>
+  </w:p>
+</w:ftr>
+</file>
+
+<file path=word/header1.xml><?xml version="1.0" encoding="utf-8"?>
+<w:hdr xmlns:m="http://schemas.openxmlformats.org/officeDocument/2006/math" xmlns:mc="http://schemas.openxmlformats.org/markup-compatibility/2006" xmlns:mo="http://schemas.microsoft.com/office/mac/office/2008/main" xmlns:mv="urn:schemas-microsoft-com:mac:vml" xmlns:o="urn:schemas-microsoft-com:office:office" xmlns:r="http://schemas.openxmlformats.org/officeDocument/2006/relationships" xmlns:v="urn:schemas-microsoft-com:vml" xmlns:w10="urn:schemas-microsoft-com:office:word" xmlns:w14="http://schemas.microsoft.com/office/word/2010/wordml" xmlns:w="http://schemas.openxmlformats.org/wordprocessingml/2006/main" xmlns:wne="http://schemas.microsoft.com/office/word/2006/wordml" xmlns:wp14="http://schemas.microsoft.com/office/word/2010/wordprocessingDrawing" xmlns:wp="http://schemas.openxmlformats.org/drawingml/2006/wordprocessingDrawing" xmlns:wpc="http://schemas.microsoft.com/office/word/2010/wordprocessingCanvas" xmlns:wpg="http://schemas.microsoft.com/office/word/2010/wordprocessingGroup" xmlns:wpi="http://schemas.microsoft.com/office/word/2010/wordprocessingInk" xmlns:wps="http://schemas.microsoft.com/office/word/2010/wordprocessingShape" mc:Ignorable="w14 wp14">
+  <w:p>
+    <w:pPr>
+      <w:pStyle w:val="Header"/>
+      <w:spacing w:before="0" w:after="80"/>
+      <w:jc w:val="right"/>
+    </w:pPr>
+    <w:r>
+      <w:rPr>
+        <w:rFonts w:ascii="Times New Roman" w:hAnsi="Times New Roman"/>
+        <w:i/>
+        <w:sz w:val="20"/>
+      </w:rPr>
+      <w:t>Báo cáo Đồ án/Tiểu luận</w:t>
+      <w:tab/>
+      <w:tab/>
+      <w:t>Ngành An toàn thông tin - HUTECH</w:t>
+    </w:r>
+  </w:p>
+</w:hdr>
 </file>
 
 <file path=word/numbering.xml><?xml version="1.0" encoding="utf-8"?>

</xml_diff>